<commit_message>
add 3lab Testing reworked 6 AI lab reworked 6&7 lab TOI
</commit_message>
<xml_diff>
--- a/AI/Report/6лаба.docx
+++ b/AI/Report/6лаба.docx
@@ -1,6 +1,6 @@
 
 <file path=word/document.xml><?xml version="1.0" encoding="utf-8"?>
-<w:document xmlns:wpc="http://schemas.microsoft.com/office/word/2010/wordprocessingCanvas" xmlns:cx="http://schemas.microsoft.com/office/drawing/2014/chartex" xmlns:cx1="http://schemas.microsoft.com/office/drawing/2015/9/8/chartex" xmlns:cx2="http://schemas.microsoft.com/office/drawing/2015/10/21/chartex" xmlns:cx3="http://schemas.microsoft.com/office/drawing/2016/5/9/chartex" xmlns:cx4="http://schemas.microsoft.com/office/drawing/2016/5/10/chartex" xmlns:cx5="http://schemas.microsoft.com/office/drawing/2016/5/11/chartex" xmlns:cx6="http://schemas.microsoft.com/office/drawing/2016/5/12/chartex" xmlns:cx7="http://schemas.microsoft.com/office/drawing/2016/5/13/chartex" xmlns:cx8="http://schemas.microsoft.com/office/drawing/2016/5/14/chartex" xmlns:mc="http://schemas.openxmlformats.org/markup-compatibility/2006" xmlns:aink="http://schemas.microsoft.com/office/drawing/2016/ink" xmlns:am3d="http://schemas.microsoft.com/office/drawing/2017/model3d" xmlns:o="urn:schemas-microsoft-com:office:office" xmlns:r="http://schemas.openxmlformats.org/officeDocument/2006/relationships" xmlns:m="http://schemas.openxmlformats.org/officeDocument/2006/math" xmlns:v="urn:schemas-microsoft-com:vml" xmlns:wp14="http://schemas.microsoft.com/office/word/2010/wordprocessingDrawing" xmlns:wp="http://schemas.openxmlformats.org/drawingml/2006/wordprocessingDrawing" xmlns:w10="urn:schemas-microsoft-com:office:word" xmlns:w="http://schemas.openxmlformats.org/wordprocessingml/2006/main" xmlns:w14="http://schemas.microsoft.com/office/word/2010/wordml" xmlns:w15="http://schemas.microsoft.com/office/word/2012/wordml" xmlns:w16cex="http://schemas.microsoft.com/office/word/2018/wordml/cex" xmlns:w16cid="http://schemas.microsoft.com/office/word/2016/wordml/cid" xmlns:w16="http://schemas.microsoft.com/office/word/2018/wordml" xmlns:w16sdtdh="http://schemas.microsoft.com/office/word/2020/wordml/sdtdatahash" xmlns:w16se="http://schemas.microsoft.com/office/word/2015/wordml/symex" xmlns:wpg="http://schemas.microsoft.com/office/word/2010/wordprocessingGroup" xmlns:wpi="http://schemas.microsoft.com/office/word/2010/wordprocessingInk" xmlns:wne="http://schemas.microsoft.com/office/word/2006/wordml" xmlns:wps="http://schemas.microsoft.com/office/word/2010/wordprocessingShape" mc:Ignorable="w14 w15 w16se w16cid w16 w16cex w16sdtdh wp14">
+<w:document xmlns:wpc="http://schemas.microsoft.com/office/word/2010/wordprocessingCanvas" xmlns:cx="http://schemas.microsoft.com/office/drawing/2014/chartex" xmlns:cx1="http://schemas.microsoft.com/office/drawing/2015/9/8/chartex" xmlns:cx2="http://schemas.microsoft.com/office/drawing/2015/10/21/chartex" xmlns:cx3="http://schemas.microsoft.com/office/drawing/2016/5/9/chartex" xmlns:cx4="http://schemas.microsoft.com/office/drawing/2016/5/10/chartex" xmlns:cx5="http://schemas.microsoft.com/office/drawing/2016/5/11/chartex" xmlns:cx6="http://schemas.microsoft.com/office/drawing/2016/5/12/chartex" xmlns:cx7="http://schemas.microsoft.com/office/drawing/2016/5/13/chartex" xmlns:cx8="http://schemas.microsoft.com/office/drawing/2016/5/14/chartex" xmlns:mc="http://schemas.openxmlformats.org/markup-compatibility/2006" xmlns:aink="http://schemas.microsoft.com/office/drawing/2016/ink" xmlns:am3d="http://schemas.microsoft.com/office/drawing/2017/model3d" xmlns:o="urn:schemas-microsoft-com:office:office" xmlns:oel="http://schemas.microsoft.com/office/2019/extlst" xmlns:r="http://schemas.openxmlformats.org/officeDocument/2006/relationships" xmlns:m="http://schemas.openxmlformats.org/officeDocument/2006/math" xmlns:v="urn:schemas-microsoft-com:vml" xmlns:wp14="http://schemas.microsoft.com/office/word/2010/wordprocessingDrawing" xmlns:wp="http://schemas.openxmlformats.org/drawingml/2006/wordprocessingDrawing" xmlns:w10="urn:schemas-microsoft-com:office:word" xmlns:w="http://schemas.openxmlformats.org/wordprocessingml/2006/main" xmlns:w14="http://schemas.microsoft.com/office/word/2010/wordml" xmlns:w15="http://schemas.microsoft.com/office/word/2012/wordml" xmlns:w16cex="http://schemas.microsoft.com/office/word/2018/wordml/cex" xmlns:w16cid="http://schemas.microsoft.com/office/word/2016/wordml/cid" xmlns:w16="http://schemas.microsoft.com/office/word/2018/wordml" xmlns:w16du="http://schemas.microsoft.com/office/word/2023/wordml/word16du" xmlns:w16sdtdh="http://schemas.microsoft.com/office/word/2020/wordml/sdtdatahash" xmlns:w16sdtfl="http://schemas.microsoft.com/office/word/2024/wordml/sdtformatlock" xmlns:w16se="http://schemas.microsoft.com/office/word/2015/wordml/symex" xmlns:wpg="http://schemas.microsoft.com/office/word/2010/wordprocessingGroup" xmlns:wpi="http://schemas.microsoft.com/office/word/2010/wordprocessingInk" xmlns:wne="http://schemas.microsoft.com/office/word/2006/wordml" xmlns:wps="http://schemas.microsoft.com/office/word/2010/wordprocessingShape" mc:Ignorable="w14 w15 w16se w16cid w16 w16cex w16sdtdh w16sdtfl w16du wp14">
   <w:body>
     <w:p>
       <w:pPr>
@@ -1351,10 +1351,10 @@
         </w:rPr>
         <w:lastRenderedPageBreak/>
         <w:drawing>
-          <wp:inline distT="0" distB="0" distL="0" distR="0" wp14:anchorId="5DAE6493" wp14:editId="43213E60">
-            <wp:extent cx="6738757" cy="8782050"/>
-            <wp:effectExtent l="0" t="0" r="5080" b="0"/>
-            <wp:docPr id="1" name="Рисунок 1"/>
+          <wp:inline distT="0" distB="0" distL="0" distR="0" wp14:anchorId="23D2E3D0" wp14:editId="7079E147">
+            <wp:extent cx="5940425" cy="7879715"/>
+            <wp:effectExtent l="0" t="0" r="3175" b="0"/>
+            <wp:docPr id="1852016149" name="Рисунок 2"/>
             <wp:cNvGraphicFramePr>
               <a:graphicFrameLocks xmlns:a="http://schemas.openxmlformats.org/drawingml/2006/main" noChangeAspect="1"/>
             </wp:cNvGraphicFramePr>
@@ -1362,36 +1362,29 @@
               <a:graphicData uri="http://schemas.openxmlformats.org/drawingml/2006/picture">
                 <pic:pic xmlns:pic="http://schemas.openxmlformats.org/drawingml/2006/picture">
                   <pic:nvPicPr>
-                    <pic:cNvPr id="0" name="Picture 1"/>
-                    <pic:cNvPicPr>
-                      <a:picLocks noChangeAspect="1" noChangeArrowheads="1"/>
-                    </pic:cNvPicPr>
+                    <pic:cNvPr id="1852016149" name="Рисунок 1852016149"/>
+                    <pic:cNvPicPr/>
                   </pic:nvPicPr>
                   <pic:blipFill>
-                    <a:blip r:embed="rId7" cstate="print">
+                    <a:blip r:embed="rId7">
                       <a:extLst>
                         <a:ext uri="{28A0092B-C50C-407E-A947-70E740481C1C}">
                           <a14:useLocalDpi xmlns:a14="http://schemas.microsoft.com/office/drawing/2010/main" val="0"/>
                         </a:ext>
                       </a:extLst>
                     </a:blip>
-                    <a:srcRect/>
                     <a:stretch>
                       <a:fillRect/>
                     </a:stretch>
                   </pic:blipFill>
-                  <pic:spPr bwMode="auto">
+                  <pic:spPr>
                     <a:xfrm>
                       <a:off x="0" y="0"/>
-                      <a:ext cx="6746138" cy="8791669"/>
+                      <a:ext cx="5940425" cy="7879715"/>
                     </a:xfrm>
                     <a:prstGeom prst="rect">
                       <a:avLst/>
                     </a:prstGeom>
-                    <a:noFill/>
-                    <a:ln>
-                      <a:noFill/>
-                    </a:ln>
                   </pic:spPr>
                 </pic:pic>
               </a:graphicData>
@@ -1408,6 +1401,28 @@
           <w:rFonts w:ascii="Arial" w:hAnsi="Arial" w:cs="Arial"/>
           <w:sz w:val="28"/>
           <w:szCs w:val="28"/>
+        </w:rPr>
+      </w:pPr>
+    </w:p>
+    <w:p>
+      <w:pPr>
+        <w:spacing w:line="360" w:lineRule="auto"/>
+        <w:ind w:hanging="851"/>
+        <w:rPr>
+          <w:rFonts w:ascii="Arial" w:hAnsi="Arial" w:cs="Arial"/>
+          <w:sz w:val="28"/>
+          <w:szCs w:val="28"/>
+        </w:rPr>
+      </w:pPr>
+    </w:p>
+    <w:p>
+      <w:pPr>
+        <w:spacing w:line="360" w:lineRule="auto"/>
+        <w:ind w:hanging="851"/>
+        <w:rPr>
+          <w:rFonts w:ascii="Arial" w:hAnsi="Arial" w:cs="Arial"/>
+          <w:sz w:val="28"/>
+          <w:szCs w:val="28"/>
           <w:lang w:val="en-US"/>
         </w:rPr>
       </w:pPr>
@@ -2911,27 +2926,13 @@
     <w:p>
       <w:pPr>
         <w:spacing w:line="360" w:lineRule="auto"/>
+        <w:ind w:hanging="1418"/>
         <w:rPr>
           <w:rFonts w:ascii="Arial" w:hAnsi="Arial" w:cs="Arial"/>
           <w:b/>
           <w:bCs/>
           <w:sz w:val="36"/>
           <w:szCs w:val="36"/>
-          <w:lang w:val="en-US"/>
-        </w:rPr>
-      </w:pPr>
-    </w:p>
-    <w:p>
-      <w:pPr>
-        <w:spacing w:line="360" w:lineRule="auto"/>
-        <w:ind w:hanging="1418"/>
-        <w:rPr>
-          <w:rFonts w:ascii="Arial" w:hAnsi="Arial" w:cs="Arial"/>
-          <w:b/>
-          <w:bCs/>
-          <w:sz w:val="36"/>
-          <w:szCs w:val="36"/>
-          <w:lang w:val="en-US"/>
         </w:rPr>
       </w:pPr>
       <w:r>
@@ -2942,14 +2943,12 @@
           <w:noProof/>
           <w:sz w:val="36"/>
           <w:szCs w:val="36"/>
-          <w:lang w:val="en-US"/>
-        </w:rPr>
-        <w:lastRenderedPageBreak/>
+        </w:rPr>
         <w:drawing>
-          <wp:inline distT="0" distB="0" distL="0" distR="0" wp14:anchorId="62ABD906" wp14:editId="3BB97E8C">
-            <wp:extent cx="7330007" cy="6695906"/>
-            <wp:effectExtent l="0" t="0" r="4445" b="0"/>
-            <wp:docPr id="4" name="Рисунок 4"/>
+          <wp:inline distT="0" distB="0" distL="0" distR="0" wp14:anchorId="56AE327E" wp14:editId="03121187">
+            <wp:extent cx="7189471" cy="5225143"/>
+            <wp:effectExtent l="0" t="0" r="0" b="0"/>
+            <wp:docPr id="487718952" name="Рисунок 1"/>
             <wp:cNvGraphicFramePr>
               <a:graphicFrameLocks xmlns:a="http://schemas.openxmlformats.org/drawingml/2006/main" noChangeAspect="1"/>
             </wp:cNvGraphicFramePr>
@@ -2957,10 +2956,8 @@
               <a:graphicData uri="http://schemas.openxmlformats.org/drawingml/2006/picture">
                 <pic:pic xmlns:pic="http://schemas.openxmlformats.org/drawingml/2006/picture">
                   <pic:nvPicPr>
-                    <pic:cNvPr id="0" name="Picture 4"/>
-                    <pic:cNvPicPr>
-                      <a:picLocks noChangeAspect="1" noChangeArrowheads="1"/>
-                    </pic:cNvPicPr>
+                    <pic:cNvPr id="487718952" name="Рисунок 487718952"/>
+                    <pic:cNvPicPr/>
                   </pic:nvPicPr>
                   <pic:blipFill>
                     <a:blip r:embed="rId8">
@@ -2970,23 +2967,18 @@
                         </a:ext>
                       </a:extLst>
                     </a:blip>
-                    <a:srcRect/>
                     <a:stretch>
                       <a:fillRect/>
                     </a:stretch>
                   </pic:blipFill>
-                  <pic:spPr bwMode="auto">
+                  <pic:spPr>
                     <a:xfrm>
                       <a:off x="0" y="0"/>
-                      <a:ext cx="7343241" cy="6707995"/>
+                      <a:ext cx="7218530" cy="5246262"/>
                     </a:xfrm>
                     <a:prstGeom prst="rect">
                       <a:avLst/>
                     </a:prstGeom>
-                    <a:noFill/>
-                    <a:ln>
-                      <a:noFill/>
-                    </a:ln>
                   </pic:spPr>
                 </pic:pic>
               </a:graphicData>
@@ -3006,7 +2998,7 @@
 </file>
 
 <file path=word/endnotes.xml><?xml version="1.0" encoding="utf-8"?>
-<w:endnotes xmlns:wpc="http://schemas.microsoft.com/office/word/2010/wordprocessingCanvas" xmlns:cx="http://schemas.microsoft.com/office/drawing/2014/chartex" xmlns:cx1="http://schemas.microsoft.com/office/drawing/2015/9/8/chartex" xmlns:cx2="http://schemas.microsoft.com/office/drawing/2015/10/21/chartex" xmlns:cx3="http://schemas.microsoft.com/office/drawing/2016/5/9/chartex" xmlns:cx4="http://schemas.microsoft.com/office/drawing/2016/5/10/chartex" xmlns:cx5="http://schemas.microsoft.com/office/drawing/2016/5/11/chartex" xmlns:cx6="http://schemas.microsoft.com/office/drawing/2016/5/12/chartex" xmlns:cx7="http://schemas.microsoft.com/office/drawing/2016/5/13/chartex" xmlns:cx8="http://schemas.microsoft.com/office/drawing/2016/5/14/chartex" xmlns:mc="http://schemas.openxmlformats.org/markup-compatibility/2006" xmlns:aink="http://schemas.microsoft.com/office/drawing/2016/ink" xmlns:am3d="http://schemas.microsoft.com/office/drawing/2017/model3d" xmlns:o="urn:schemas-microsoft-com:office:office" xmlns:r="http://schemas.openxmlformats.org/officeDocument/2006/relationships" xmlns:m="http://schemas.openxmlformats.org/officeDocument/2006/math" xmlns:v="urn:schemas-microsoft-com:vml" xmlns:wp14="http://schemas.microsoft.com/office/word/2010/wordprocessingDrawing" xmlns:wp="http://schemas.openxmlformats.org/drawingml/2006/wordprocessingDrawing" xmlns:w10="urn:schemas-microsoft-com:office:word" xmlns:w="http://schemas.openxmlformats.org/wordprocessingml/2006/main" xmlns:w14="http://schemas.microsoft.com/office/word/2010/wordml" xmlns:w15="http://schemas.microsoft.com/office/word/2012/wordml" xmlns:w16cex="http://schemas.microsoft.com/office/word/2018/wordml/cex" xmlns:w16cid="http://schemas.microsoft.com/office/word/2016/wordml/cid" xmlns:w16="http://schemas.microsoft.com/office/word/2018/wordml" xmlns:w16sdtdh="http://schemas.microsoft.com/office/word/2020/wordml/sdtdatahash" xmlns:w16se="http://schemas.microsoft.com/office/word/2015/wordml/symex" xmlns:wpg="http://schemas.microsoft.com/office/word/2010/wordprocessingGroup" xmlns:wpi="http://schemas.microsoft.com/office/word/2010/wordprocessingInk" xmlns:wne="http://schemas.microsoft.com/office/word/2006/wordml" xmlns:wps="http://schemas.microsoft.com/office/word/2010/wordprocessingShape" mc:Ignorable="w14 w15 w16se w16cid w16 w16cex w16sdtdh wp14">
+<w:endnotes xmlns:wpc="http://schemas.microsoft.com/office/word/2010/wordprocessingCanvas" xmlns:cx="http://schemas.microsoft.com/office/drawing/2014/chartex" xmlns:cx1="http://schemas.microsoft.com/office/drawing/2015/9/8/chartex" xmlns:cx2="http://schemas.microsoft.com/office/drawing/2015/10/21/chartex" xmlns:cx3="http://schemas.microsoft.com/office/drawing/2016/5/9/chartex" xmlns:cx4="http://schemas.microsoft.com/office/drawing/2016/5/10/chartex" xmlns:cx5="http://schemas.microsoft.com/office/drawing/2016/5/11/chartex" xmlns:cx6="http://schemas.microsoft.com/office/drawing/2016/5/12/chartex" xmlns:cx7="http://schemas.microsoft.com/office/drawing/2016/5/13/chartex" xmlns:cx8="http://schemas.microsoft.com/office/drawing/2016/5/14/chartex" xmlns:mc="http://schemas.openxmlformats.org/markup-compatibility/2006" xmlns:aink="http://schemas.microsoft.com/office/drawing/2016/ink" xmlns:am3d="http://schemas.microsoft.com/office/drawing/2017/model3d" xmlns:o="urn:schemas-microsoft-com:office:office" xmlns:oel="http://schemas.microsoft.com/office/2019/extlst" xmlns:r="http://schemas.openxmlformats.org/officeDocument/2006/relationships" xmlns:m="http://schemas.openxmlformats.org/officeDocument/2006/math" xmlns:v="urn:schemas-microsoft-com:vml" xmlns:wp14="http://schemas.microsoft.com/office/word/2010/wordprocessingDrawing" xmlns:wp="http://schemas.openxmlformats.org/drawingml/2006/wordprocessingDrawing" xmlns:w10="urn:schemas-microsoft-com:office:word" xmlns:w="http://schemas.openxmlformats.org/wordprocessingml/2006/main" xmlns:w14="http://schemas.microsoft.com/office/word/2010/wordml" xmlns:w15="http://schemas.microsoft.com/office/word/2012/wordml" xmlns:w16cex="http://schemas.microsoft.com/office/word/2018/wordml/cex" xmlns:w16cid="http://schemas.microsoft.com/office/word/2016/wordml/cid" xmlns:w16="http://schemas.microsoft.com/office/word/2018/wordml" xmlns:w16du="http://schemas.microsoft.com/office/word/2023/wordml/word16du" xmlns:w16sdtdh="http://schemas.microsoft.com/office/word/2020/wordml/sdtdatahash" xmlns:w16sdtfl="http://schemas.microsoft.com/office/word/2024/wordml/sdtformatlock" xmlns:w16se="http://schemas.microsoft.com/office/word/2015/wordml/symex" xmlns:wpg="http://schemas.microsoft.com/office/word/2010/wordprocessingGroup" xmlns:wpi="http://schemas.microsoft.com/office/word/2010/wordprocessingInk" xmlns:wne="http://schemas.microsoft.com/office/word/2006/wordml" xmlns:wps="http://schemas.microsoft.com/office/word/2010/wordprocessingShape" mc:Ignorable="w14 w15 w16se w16cid w16 w16cex w16sdtdh w16sdtfl w16du wp14">
   <w:endnote w:type="separator" w:id="-1">
     <w:p>
       <w:pPr>
@@ -3031,7 +3023,7 @@
 </file>
 
 <file path=word/footnotes.xml><?xml version="1.0" encoding="utf-8"?>
-<w:footnotes xmlns:wpc="http://schemas.microsoft.com/office/word/2010/wordprocessingCanvas" xmlns:cx="http://schemas.microsoft.com/office/drawing/2014/chartex" xmlns:cx1="http://schemas.microsoft.com/office/drawing/2015/9/8/chartex" xmlns:cx2="http://schemas.microsoft.com/office/drawing/2015/10/21/chartex" xmlns:cx3="http://schemas.microsoft.com/office/drawing/2016/5/9/chartex" xmlns:cx4="http://schemas.microsoft.com/office/drawing/2016/5/10/chartex" xmlns:cx5="http://schemas.microsoft.com/office/drawing/2016/5/11/chartex" xmlns:cx6="http://schemas.microsoft.com/office/drawing/2016/5/12/chartex" xmlns:cx7="http://schemas.microsoft.com/office/drawing/2016/5/13/chartex" xmlns:cx8="http://schemas.microsoft.com/office/drawing/2016/5/14/chartex" xmlns:mc="http://schemas.openxmlformats.org/markup-compatibility/2006" xmlns:aink="http://schemas.microsoft.com/office/drawing/2016/ink" xmlns:am3d="http://schemas.microsoft.com/office/drawing/2017/model3d" xmlns:o="urn:schemas-microsoft-com:office:office" xmlns:r="http://schemas.openxmlformats.org/officeDocument/2006/relationships" xmlns:m="http://schemas.openxmlformats.org/officeDocument/2006/math" xmlns:v="urn:schemas-microsoft-com:vml" xmlns:wp14="http://schemas.microsoft.com/office/word/2010/wordprocessingDrawing" xmlns:wp="http://schemas.openxmlformats.org/drawingml/2006/wordprocessingDrawing" xmlns:w10="urn:schemas-microsoft-com:office:word" xmlns:w="http://schemas.openxmlformats.org/wordprocessingml/2006/main" xmlns:w14="http://schemas.microsoft.com/office/word/2010/wordml" xmlns:w15="http://schemas.microsoft.com/office/word/2012/wordml" xmlns:w16cex="http://schemas.microsoft.com/office/word/2018/wordml/cex" xmlns:w16cid="http://schemas.microsoft.com/office/word/2016/wordml/cid" xmlns:w16="http://schemas.microsoft.com/office/word/2018/wordml" xmlns:w16sdtdh="http://schemas.microsoft.com/office/word/2020/wordml/sdtdatahash" xmlns:w16se="http://schemas.microsoft.com/office/word/2015/wordml/symex" xmlns:wpg="http://schemas.microsoft.com/office/word/2010/wordprocessingGroup" xmlns:wpi="http://schemas.microsoft.com/office/word/2010/wordprocessingInk" xmlns:wne="http://schemas.microsoft.com/office/word/2006/wordml" xmlns:wps="http://schemas.microsoft.com/office/word/2010/wordprocessingShape" mc:Ignorable="w14 w15 w16se w16cid w16 w16cex w16sdtdh wp14">
+<w:footnotes xmlns:wpc="http://schemas.microsoft.com/office/word/2010/wordprocessingCanvas" xmlns:cx="http://schemas.microsoft.com/office/drawing/2014/chartex" xmlns:cx1="http://schemas.microsoft.com/office/drawing/2015/9/8/chartex" xmlns:cx2="http://schemas.microsoft.com/office/drawing/2015/10/21/chartex" xmlns:cx3="http://schemas.microsoft.com/office/drawing/2016/5/9/chartex" xmlns:cx4="http://schemas.microsoft.com/office/drawing/2016/5/10/chartex" xmlns:cx5="http://schemas.microsoft.com/office/drawing/2016/5/11/chartex" xmlns:cx6="http://schemas.microsoft.com/office/drawing/2016/5/12/chartex" xmlns:cx7="http://schemas.microsoft.com/office/drawing/2016/5/13/chartex" xmlns:cx8="http://schemas.microsoft.com/office/drawing/2016/5/14/chartex" xmlns:mc="http://schemas.openxmlformats.org/markup-compatibility/2006" xmlns:aink="http://schemas.microsoft.com/office/drawing/2016/ink" xmlns:am3d="http://schemas.microsoft.com/office/drawing/2017/model3d" xmlns:o="urn:schemas-microsoft-com:office:office" xmlns:oel="http://schemas.microsoft.com/office/2019/extlst" xmlns:r="http://schemas.openxmlformats.org/officeDocument/2006/relationships" xmlns:m="http://schemas.openxmlformats.org/officeDocument/2006/math" xmlns:v="urn:schemas-microsoft-com:vml" xmlns:wp14="http://schemas.microsoft.com/office/word/2010/wordprocessingDrawing" xmlns:wp="http://schemas.openxmlformats.org/drawingml/2006/wordprocessingDrawing" xmlns:w10="urn:schemas-microsoft-com:office:word" xmlns:w="http://schemas.openxmlformats.org/wordprocessingml/2006/main" xmlns:w14="http://schemas.microsoft.com/office/word/2010/wordml" xmlns:w15="http://schemas.microsoft.com/office/word/2012/wordml" xmlns:w16cex="http://schemas.microsoft.com/office/word/2018/wordml/cex" xmlns:w16cid="http://schemas.microsoft.com/office/word/2016/wordml/cid" xmlns:w16="http://schemas.microsoft.com/office/word/2018/wordml" xmlns:w16du="http://schemas.microsoft.com/office/word/2023/wordml/word16du" xmlns:w16sdtdh="http://schemas.microsoft.com/office/word/2020/wordml/sdtdatahash" xmlns:w16sdtfl="http://schemas.microsoft.com/office/word/2024/wordml/sdtformatlock" xmlns:w16se="http://schemas.microsoft.com/office/word/2015/wordml/symex" xmlns:wpg="http://schemas.microsoft.com/office/word/2010/wordprocessingGroup" xmlns:wpi="http://schemas.microsoft.com/office/word/2010/wordprocessingInk" xmlns:wne="http://schemas.microsoft.com/office/word/2006/wordml" xmlns:wps="http://schemas.microsoft.com/office/word/2010/wordprocessingShape" mc:Ignorable="w14 w15 w16se w16cid w16 w16cex w16sdtdh w16sdtfl w16du wp14">
   <w:footnote w:type="separator" w:id="-1">
     <w:p>
       <w:pPr>
@@ -3056,7 +3048,7 @@
 </file>
 
 <file path=word/numbering.xml><?xml version="1.0" encoding="utf-8"?>
-<w:numbering xmlns:wpc="http://schemas.microsoft.com/office/word/2010/wordprocessingCanvas" xmlns:cx="http://schemas.microsoft.com/office/drawing/2014/chartex" xmlns:cx1="http://schemas.microsoft.com/office/drawing/2015/9/8/chartex" xmlns:cx2="http://schemas.microsoft.com/office/drawing/2015/10/21/chartex" xmlns:cx3="http://schemas.microsoft.com/office/drawing/2016/5/9/chartex" xmlns:cx4="http://schemas.microsoft.com/office/drawing/2016/5/10/chartex" xmlns:cx5="http://schemas.microsoft.com/office/drawing/2016/5/11/chartex" xmlns:cx6="http://schemas.microsoft.com/office/drawing/2016/5/12/chartex" xmlns:cx7="http://schemas.microsoft.com/office/drawing/2016/5/13/chartex" xmlns:cx8="http://schemas.microsoft.com/office/drawing/2016/5/14/chartex" xmlns:mc="http://schemas.openxmlformats.org/markup-compatibility/2006" xmlns:aink="http://schemas.microsoft.com/office/drawing/2016/ink" xmlns:am3d="http://schemas.microsoft.com/office/drawing/2017/model3d" xmlns:o="urn:schemas-microsoft-com:office:office" xmlns:r="http://schemas.openxmlformats.org/officeDocument/2006/relationships" xmlns:m="http://schemas.openxmlformats.org/officeDocument/2006/math" xmlns:v="urn:schemas-microsoft-com:vml" xmlns:wp14="http://schemas.microsoft.com/office/word/2010/wordprocessingDrawing" xmlns:wp="http://schemas.openxmlformats.org/drawingml/2006/wordprocessingDrawing" xmlns:w10="urn:schemas-microsoft-com:office:word" xmlns:w="http://schemas.openxmlformats.org/wordprocessingml/2006/main" xmlns:w14="http://schemas.microsoft.com/office/word/2010/wordml" xmlns:w15="http://schemas.microsoft.com/office/word/2012/wordml" xmlns:w16cex="http://schemas.microsoft.com/office/word/2018/wordml/cex" xmlns:w16cid="http://schemas.microsoft.com/office/word/2016/wordml/cid" xmlns:w16="http://schemas.microsoft.com/office/word/2018/wordml" xmlns:w16sdtdh="http://schemas.microsoft.com/office/word/2020/wordml/sdtdatahash" xmlns:w16se="http://schemas.microsoft.com/office/word/2015/wordml/symex" xmlns:wpg="http://schemas.microsoft.com/office/word/2010/wordprocessingGroup" xmlns:wpi="http://schemas.microsoft.com/office/word/2010/wordprocessingInk" xmlns:wne="http://schemas.microsoft.com/office/word/2006/wordml" xmlns:wps="http://schemas.microsoft.com/office/word/2010/wordprocessingShape" mc:Ignorable="w14 w15 w16se w16cid w16 w16cex w16sdtdh wp14">
+<w:numbering xmlns:wpc="http://schemas.microsoft.com/office/word/2010/wordprocessingCanvas" xmlns:cx="http://schemas.microsoft.com/office/drawing/2014/chartex" xmlns:cx1="http://schemas.microsoft.com/office/drawing/2015/9/8/chartex" xmlns:cx2="http://schemas.microsoft.com/office/drawing/2015/10/21/chartex" xmlns:cx3="http://schemas.microsoft.com/office/drawing/2016/5/9/chartex" xmlns:cx4="http://schemas.microsoft.com/office/drawing/2016/5/10/chartex" xmlns:cx5="http://schemas.microsoft.com/office/drawing/2016/5/11/chartex" xmlns:cx6="http://schemas.microsoft.com/office/drawing/2016/5/12/chartex" xmlns:cx7="http://schemas.microsoft.com/office/drawing/2016/5/13/chartex" xmlns:cx8="http://schemas.microsoft.com/office/drawing/2016/5/14/chartex" xmlns:mc="http://schemas.openxmlformats.org/markup-compatibility/2006" xmlns:aink="http://schemas.microsoft.com/office/drawing/2016/ink" xmlns:am3d="http://schemas.microsoft.com/office/drawing/2017/model3d" xmlns:o="urn:schemas-microsoft-com:office:office" xmlns:oel="http://schemas.microsoft.com/office/2019/extlst" xmlns:r="http://schemas.openxmlformats.org/officeDocument/2006/relationships" xmlns:m="http://schemas.openxmlformats.org/officeDocument/2006/math" xmlns:v="urn:schemas-microsoft-com:vml" xmlns:wp14="http://schemas.microsoft.com/office/word/2010/wordprocessingDrawing" xmlns:wp="http://schemas.openxmlformats.org/drawingml/2006/wordprocessingDrawing" xmlns:w10="urn:schemas-microsoft-com:office:word" xmlns:w="http://schemas.openxmlformats.org/wordprocessingml/2006/main" xmlns:w14="http://schemas.microsoft.com/office/word/2010/wordml" xmlns:w15="http://schemas.microsoft.com/office/word/2012/wordml" xmlns:w16cex="http://schemas.microsoft.com/office/word/2018/wordml/cex" xmlns:w16cid="http://schemas.microsoft.com/office/word/2016/wordml/cid" xmlns:w16="http://schemas.microsoft.com/office/word/2018/wordml" xmlns:w16du="http://schemas.microsoft.com/office/word/2023/wordml/word16du" xmlns:w16sdtdh="http://schemas.microsoft.com/office/word/2020/wordml/sdtdatahash" xmlns:w16sdtfl="http://schemas.microsoft.com/office/word/2024/wordml/sdtformatlock" xmlns:w16se="http://schemas.microsoft.com/office/word/2015/wordml/symex" xmlns:wpg="http://schemas.microsoft.com/office/word/2010/wordprocessingGroup" xmlns:wpi="http://schemas.microsoft.com/office/word/2010/wordprocessingInk" xmlns:wne="http://schemas.microsoft.com/office/word/2006/wordml" xmlns:wps="http://schemas.microsoft.com/office/word/2010/wordprocessingShape" mc:Ignorable="w14 w15 w16se w16cid w16 w16cex w16sdtdh w16sdtfl w16du wp14">
   <w:abstractNum w:abstractNumId="0" w15:restartNumberingAfterBreak="0">
     <w:nsid w:val="084D1A9B"/>
     <w:multiLevelType w:val="hybridMultilevel"/>
@@ -5024,68 +5016,68 @@
       </w:pPr>
     </w:lvl>
   </w:abstractNum>
-  <w:num w:numId="1">
+  <w:num w:numId="1" w16cid:durableId="93717480">
     <w:abstractNumId w:val="14"/>
   </w:num>
-  <w:num w:numId="2">
+  <w:num w:numId="2" w16cid:durableId="931205216">
     <w:abstractNumId w:val="18"/>
   </w:num>
-  <w:num w:numId="3">
+  <w:num w:numId="3" w16cid:durableId="1384719433">
     <w:abstractNumId w:val="11"/>
   </w:num>
-  <w:num w:numId="4">
+  <w:num w:numId="4" w16cid:durableId="1631746496">
     <w:abstractNumId w:val="15"/>
   </w:num>
-  <w:num w:numId="5">
+  <w:num w:numId="5" w16cid:durableId="2116905282">
     <w:abstractNumId w:val="3"/>
   </w:num>
-  <w:num w:numId="6">
+  <w:num w:numId="6" w16cid:durableId="1774126850">
     <w:abstractNumId w:val="5"/>
   </w:num>
-  <w:num w:numId="7">
+  <w:num w:numId="7" w16cid:durableId="887567727">
     <w:abstractNumId w:val="12"/>
   </w:num>
-  <w:num w:numId="8">
+  <w:num w:numId="8" w16cid:durableId="968168455">
     <w:abstractNumId w:val="10"/>
   </w:num>
-  <w:num w:numId="9">
+  <w:num w:numId="9" w16cid:durableId="1473794184">
     <w:abstractNumId w:val="6"/>
   </w:num>
-  <w:num w:numId="10">
+  <w:num w:numId="10" w16cid:durableId="428816666">
     <w:abstractNumId w:val="8"/>
   </w:num>
-  <w:num w:numId="11">
+  <w:num w:numId="11" w16cid:durableId="1919747067">
     <w:abstractNumId w:val="16"/>
   </w:num>
-  <w:num w:numId="12">
+  <w:num w:numId="12" w16cid:durableId="2129859952">
     <w:abstractNumId w:val="13"/>
   </w:num>
-  <w:num w:numId="13">
+  <w:num w:numId="13" w16cid:durableId="989167311">
     <w:abstractNumId w:val="17"/>
   </w:num>
-  <w:num w:numId="14">
+  <w:num w:numId="14" w16cid:durableId="551506454">
     <w:abstractNumId w:val="7"/>
   </w:num>
-  <w:num w:numId="15">
+  <w:num w:numId="15" w16cid:durableId="936256138">
     <w:abstractNumId w:val="0"/>
   </w:num>
-  <w:num w:numId="16">
+  <w:num w:numId="16" w16cid:durableId="1860006256">
     <w:abstractNumId w:val="9"/>
   </w:num>
-  <w:num w:numId="17">
+  <w:num w:numId="17" w16cid:durableId="160124834">
     <w:abstractNumId w:val="2"/>
   </w:num>
-  <w:num w:numId="18">
+  <w:num w:numId="18" w16cid:durableId="1829051469">
     <w:abstractNumId w:val="1"/>
   </w:num>
-  <w:num w:numId="19">
+  <w:num w:numId="19" w16cid:durableId="730344159">
     <w:abstractNumId w:val="4"/>
   </w:num>
 </w:numbering>
 </file>
 
 <file path=word/styles.xml><?xml version="1.0" encoding="utf-8"?>
-<w:styles xmlns:mc="http://schemas.openxmlformats.org/markup-compatibility/2006" xmlns:r="http://schemas.openxmlformats.org/officeDocument/2006/relationships" xmlns:w="http://schemas.openxmlformats.org/wordprocessingml/2006/main" xmlns:w14="http://schemas.microsoft.com/office/word/2010/wordml" xmlns:w15="http://schemas.microsoft.com/office/word/2012/wordml" xmlns:w16cex="http://schemas.microsoft.com/office/word/2018/wordml/cex" xmlns:w16cid="http://schemas.microsoft.com/office/word/2016/wordml/cid" xmlns:w16="http://schemas.microsoft.com/office/word/2018/wordml" xmlns:w16sdtdh="http://schemas.microsoft.com/office/word/2020/wordml/sdtdatahash" xmlns:w16se="http://schemas.microsoft.com/office/word/2015/wordml/symex" mc:Ignorable="w14 w15 w16se w16cid w16 w16cex w16sdtdh">
+<w:styles xmlns:mc="http://schemas.openxmlformats.org/markup-compatibility/2006" xmlns:r="http://schemas.openxmlformats.org/officeDocument/2006/relationships" xmlns:w="http://schemas.openxmlformats.org/wordprocessingml/2006/main" xmlns:w14="http://schemas.microsoft.com/office/word/2010/wordml" xmlns:w15="http://schemas.microsoft.com/office/word/2012/wordml" xmlns:w16cex="http://schemas.microsoft.com/office/word/2018/wordml/cex" xmlns:w16cid="http://schemas.microsoft.com/office/word/2016/wordml/cid" xmlns:w16="http://schemas.microsoft.com/office/word/2018/wordml" xmlns:w16du="http://schemas.microsoft.com/office/word/2023/wordml/word16du" xmlns:w16sdtdh="http://schemas.microsoft.com/office/word/2020/wordml/sdtdatahash" xmlns:w16sdtfl="http://schemas.microsoft.com/office/word/2024/wordml/sdtformatlock" xmlns:w16se="http://schemas.microsoft.com/office/word/2015/wordml/symex" mc:Ignorable="w14 w15 w16se w16cid w16 w16cex w16sdtdh w16sdtfl w16du">
   <w:docDefaults>
     <w:rPrDefault>
       <w:rPr>

</xml_diff>